<commit_message>
ACT-07: move route legend clear of the drawing
</commit_message>
<xml_diff>
--- a/Claude outputs/Session7_Vectors_TEACHER_GUIDE.docx
+++ b/Claude outputs/Session7_Vectors_TEACHER_GUIDE.docx
@@ -9692,7 +9692,7 @@
           <w:sz w:val="20"/>
           <w:szCs w:val="20"/>
         </w:rPr>
-        <w:t xml:space="preserve">If a group gives you fewer than eight teams, some teams take two numbers (Team 1 also plays Team 8, and so on) — say so out loud, because the panel charges 60 seconds for decrypting a leg that is not yours and it cannot know you gave them two.</w:t>
+        <w:t xml:space="preserve">If a group gives you fewer than eight teams, a team cannot hold two legs on one screen — the device locks to one. Have that team open the page a second time on a phone and confirm the extra number there, or simply read the missing leg out yourself from the table below. Standardising on eight teams avoids the question entirely.</w:t>
       </w:r>
     </w:p>
     <w:p>
@@ -9890,7 +9890,7 @@
                 <w:sz w:val="19"/>
                 <w:szCs w:val="19"/>
               </w:rPr>
-              <w:t xml:space="preserve">They type their team number into YOUR TEAM and press DECRYPT. Only their own row turns readable — for example Team 3 sees leg L3 = ( 2 , −6 ) km. Everything else stays blacked out.</w:t>
+              <w:t xml:space="preserve">They type their team number into YOUR TEAM and press DECRYPT. The button changes to CONFIRM TEAM 3 and asks them to press again — a deliberate second step, because the choice is permanent.</w:t>
             </w:r>
           </w:p>
         </w:tc>
@@ -9917,7 +9917,7 @@
                 <w:sz w:val="19"/>
                 <w:szCs w:val="19"/>
               </w:rPr>
-              <w:t xml:space="preserve">3</w:t>
+              <w:t xml:space="preserve">2b</w:t>
             </w:r>
           </w:p>
         </w:tc>
@@ -9942,7 +9942,7 @@
                 <w:sz w:val="19"/>
                 <w:szCs w:val="19"/>
               </w:rPr>
-              <w:t xml:space="preserve">They wait for you to call their team, then read their two numbers out loud. That is their whole contribution.</w:t>
+              <w:t xml:space="preserve">On the second press the device locks: their row opens (Team 3 sees leg L3 = ( 2 , −6 ) km), the field goes read-only showing "Team 3", and the button reads LOCKED. No other leg on that device will ever open — typing another number does nothing at all.</w:t>
             </w:r>
           </w:p>
         </w:tc>
@@ -9970,6 +9970,59 @@
                 <w:sz w:val="19"/>
                 <w:szCs w:val="19"/>
               </w:rPr>
+              <w:t xml:space="preserve">3</w:t>
+            </w:r>
+          </w:p>
+        </w:tc>
+        <w:tc>
+          <w:tcPr>
+            <w:tcW w:type="dxa" w:w="9180"/>
+            <w:shd w:fill="F2F5F8" w:color="auto" w:val="clear"/>
+            <w:tcMar>
+              <w:top w:type="dxa" w:w="70"/>
+              <w:left w:type="dxa" w:w="110"/>
+              <w:bottom w:type="dxa" w:w="70"/>
+              <w:right w:type="dxa" w:w="110"/>
+            </w:tcMar>
+          </w:tcPr>
+          <w:p>
+            <w:pPr>
+              <w:spacing w:after="0" w:line="250"/>
+            </w:pPr>
+            <w:r>
+              <w:rPr>
+                <w:rFonts w:ascii="Calibri" w:cs="Calibri" w:eastAsia="Calibri" w:hAnsi="Calibri"/>
+                <w:color w:val="1B2A3A"/>
+                <w:sz w:val="19"/>
+                <w:szCs w:val="19"/>
+              </w:rPr>
+              <w:t xml:space="preserve">They wait for you to call their team, then read their two numbers out loud. That is their whole contribution.</w:t>
+            </w:r>
+          </w:p>
+        </w:tc>
+      </w:tr>
+      <w:tr>
+        <w:tc>
+          <w:tcPr>
+            <w:tcW w:type="dxa" w:w="900"/>
+            <w:tcMar>
+              <w:top w:type="dxa" w:w="70"/>
+              <w:left w:type="dxa" w:w="110"/>
+              <w:bottom w:type="dxa" w:w="70"/>
+              <w:right w:type="dxa" w:w="110"/>
+            </w:tcMar>
+          </w:tcPr>
+          <w:p>
+            <w:pPr>
+              <w:spacing w:after="0" w:line="250"/>
+            </w:pPr>
+            <w:r>
+              <w:rPr>
+                <w:rFonts w:ascii="Calibri" w:cs="Calibri" w:eastAsia="Calibri" w:hAnsi="Calibri"/>
+                <w:color w:val="1B2A3A"/>
+                <w:sz w:val="19"/>
+                <w:szCs w:val="19"/>
+              </w:rPr>
               <w:t xml:space="preserve">4</w:t>
             </w:r>
           </w:p>
@@ -9977,7 +10030,6 @@
         <w:tc>
           <w:tcPr>
             <w:tcW w:type="dxa" w:w="9180"/>
-            <w:shd w:fill="F2F5F8" w:color="auto" w:val="clear"/>
             <w:tcMar>
               <w:top w:type="dxa" w:w="70"/>
               <w:left w:type="dxa" w:w="110"/>
@@ -10015,7 +10067,7 @@
           <w:sz w:val="20"/>
           <w:szCs w:val="20"/>
         </w:rPr>
-        <w:t xml:space="preserve">Decrypting somebody else's leg costs 60 seconds and gains nothing — eight legs read at the board take under two minutes, and stealing them one at a time would cost eight. The panel says this on screen.</w:t>
+        <w:t xml:space="preserve">One decrypt per device, enforced in the page's logic rather than by an honour system: after the confirm, no other leg opens on that screen for the rest of the session. That is why the panel asks twice — tell the room to read their team number off the board before they press.</w:t>
       </w:r>
     </w:p>
     <w:p>
@@ -11742,7 +11794,7 @@
                 <w:sz w:val="19"/>
                 <w:szCs w:val="19"/>
               </w:rPr>
-              <w:t xml:space="preserve">You can, and each one costs a minute of your clock. It is faster to wait for the board.</w:t>
+              <w:t xml:space="preserve">No. One per device, and it locks. The other seven come to you across the room.</w:t>
             </w:r>
           </w:p>
         </w:tc>
@@ -11770,7 +11822,7 @@
                 <w:sz w:val="19"/>
                 <w:szCs w:val="19"/>
               </w:rPr>
-              <w:t xml:space="preserve">"What do we do while other teams read?"</w:t>
+              <w:t xml:space="preserve">"We confirmed the wrong team."</w:t>
             </w:r>
           </w:p>
         </w:tc>
@@ -11796,7 +11848,7 @@
                 <w:sz w:val="19"/>
                 <w:szCs w:val="19"/>
               </w:rPr>
-              <w:t xml:space="preserve">Write the running total down as it grows. You will need the final one, and if it goes wrong you will be the team that spots it.</w:t>
+              <w:t xml:space="preserve">Rare, because it asks twice — but if it happens, just read them their real leg from the table in this section. It costs nothing and a page reload would wipe their whole run, so do not suggest that.</w:t>
             </w:r>
           </w:p>
         </w:tc>
@@ -11823,7 +11875,7 @@
                 <w:sz w:val="19"/>
                 <w:szCs w:val="19"/>
               </w:rPr>
-              <w:t xml:space="preserve">"Which number goes first?"</w:t>
+              <w:t xml:space="preserve">"What do we do while other teams read?"</w:t>
             </w:r>
           </w:p>
         </w:tc>
@@ -11848,7 +11900,7 @@
                 <w:sz w:val="19"/>
                 <w:szCs w:val="19"/>
               </w:rPr>
-              <w:t xml:space="preserve">x then y, the same order as every lock tonight.</w:t>
+              <w:t xml:space="preserve">Write the running total down as it grows. You will need the final one, and if it goes wrong you will be the team that spots it.</w:t>
             </w:r>
           </w:p>
         </w:tc>
@@ -11876,7 +11928,7 @@
                 <w:sz w:val="19"/>
                 <w:szCs w:val="19"/>
               </w:rPr>
-              <w:t xml:space="preserve">"Is |R| a decimal?"</w:t>
+              <w:t xml:space="preserve">"Which number goes first?"</w:t>
             </w:r>
           </w:p>
         </w:tc>
@@ -11902,7 +11954,7 @@
                 <w:sz w:val="19"/>
                 <w:szCs w:val="19"/>
               </w:rPr>
-              <w:t xml:space="preserve">No — it comes out exactly 20. If yours is not a whole number, check your squares.</w:t>
+              <w:t xml:space="preserve">x then y, the same order as every lock tonight.</w:t>
             </w:r>
           </w:p>
         </w:tc>
@@ -11929,6 +11981,59 @@
                 <w:sz w:val="19"/>
                 <w:szCs w:val="19"/>
               </w:rPr>
+              <w:t xml:space="preserve">"Is |R| a decimal?"</w:t>
+            </w:r>
+          </w:p>
+        </w:tc>
+        <w:tc>
+          <w:tcPr>
+            <w:tcW w:type="dxa" w:w="6680"/>
+            <w:tcMar>
+              <w:top w:type="dxa" w:w="70"/>
+              <w:left w:type="dxa" w:w="110"/>
+              <w:bottom w:type="dxa" w:w="70"/>
+              <w:right w:type="dxa" w:w="110"/>
+            </w:tcMar>
+          </w:tcPr>
+          <w:p>
+            <w:pPr>
+              <w:spacing w:after="0" w:line="250"/>
+            </w:pPr>
+            <w:r>
+              <w:rPr>
+                <w:rFonts w:ascii="Calibri" w:cs="Calibri" w:eastAsia="Calibri" w:hAnsi="Calibri"/>
+                <w:color w:val="1B2A3A"/>
+                <w:sz w:val="19"/>
+                <w:szCs w:val="19"/>
+              </w:rPr>
+              <w:t xml:space="preserve">No — it comes out exactly 20. If yours is not a whole number, check your squares.</w:t>
+            </w:r>
+          </w:p>
+        </w:tc>
+      </w:tr>
+      <w:tr>
+        <w:tc>
+          <w:tcPr>
+            <w:tcW w:type="dxa" w:w="3400"/>
+            <w:shd w:fill="F2F5F8" w:color="auto" w:val="clear"/>
+            <w:tcMar>
+              <w:top w:type="dxa" w:w="70"/>
+              <w:left w:type="dxa" w:w="110"/>
+              <w:bottom w:type="dxa" w:w="70"/>
+              <w:right w:type="dxa" w:w="110"/>
+            </w:tcMar>
+          </w:tcPr>
+          <w:p>
+            <w:pPr>
+              <w:spacing w:after="0" w:line="250"/>
+            </w:pPr>
+            <w:r>
+              <w:rPr>
+                <w:rFonts w:ascii="Calibri" w:cs="Calibri" w:eastAsia="Calibri" w:hAnsi="Calibri"/>
+                <w:color w:val="1B2A3A"/>
+                <w:sz w:val="19"/>
+                <w:szCs w:val="19"/>
+              </w:rPr>
               <w:t xml:space="preserve">"Do we use the direction from the calculator?"</w:t>
             </w:r>
           </w:p>
@@ -11936,6 +12041,7 @@
         <w:tc>
           <w:tcPr>
             <w:tcW w:type="dxa" w:w="6680"/>
+            <w:shd w:fill="F2F5F8" w:color="auto" w:val="clear"/>
             <w:tcMar>
               <w:top w:type="dxa" w:w="70"/>
               <w:left w:type="dxa" w:w="110"/>

</xml_diff>